<commit_message>
feat: update experience details for Senior Software Engineer role
</commit_message>
<xml_diff>
--- a/pdf/jayson-monterroso-resume.docx
+++ b/pdf/jayson-monterroso-resume.docx
@@ -1424,28 +1424,25 @@
                 <w:bCs w:val="0"/>
                 <w:color w:val="595959"/>
               </w:rPr>
-              <w:t>Intevity</w:t>
+              <w:t>Intevity | Under Armour | 2025 - Present</w:t>
             </w:r>
             <w:proofErr w:type="spellEnd"/>
             <w:r>
               <w:rPr>
                 <w:color w:val="595959"/>
               </w:rPr>
-              <w:t xml:space="preserve"> | Under </w:t>
             </w:r>
             <w:proofErr w:type="spellStart"/>
             <w:r>
               <w:rPr>
                 <w:color w:val="595959"/>
               </w:rPr>
-              <w:t>Armour</w:t>
             </w:r>
             <w:proofErr w:type="spellEnd"/>
             <w:r>
               <w:rPr>
                 <w:color w:val="595959"/>
               </w:rPr>
-              <w:t xml:space="preserve"> | 2025 </w:t>
             </w:r>
           </w:p>
           <w:p>
@@ -1453,65 +1450,57 @@
               <w:pStyle w:val="Positionbullet"/>
             </w:pPr>
             <w:r>
-              <w:t xml:space="preserve">Replaced </w:t>
+              <w:t>Replaced MuleSoft APIs (events, orders, points, profiles, rewards, Snowflake, Aptos) with scalable Node.js microservices, reducing third-party licensing expenses and enabling complete in-house API ownership for faster iteration and maintainability.</w:t>
             </w:r>
             <w:proofErr w:type="spellStart"/>
-            <w:r>
-              <w:t>Mulesoft</w:t>
-            </w:r>
+            <w:r/>
             <w:proofErr w:type="spellEnd"/>
-            <w:r>
-              <w:t xml:space="preserve"> APIs (events, orders, points, profiles, rewards, Snowflake, Aptos) with scalable Node.js microservices, reducing third-party licensing expenses and enabling complete in-house AP</w:t>
-            </w:r>
-            <w:r>
-              <w:t>I</w:t>
-            </w:r>
-            <w:r>
-              <w:t xml:space="preserve"> ownership for faster iteration and maintainability.</w:t>
-            </w:r>
+            <w:r/>
+            <w:r/>
+            <w:r/>
           </w:p>
           <w:p>
             <w:pPr>
               <w:pStyle w:val="Positionbullet"/>
             </w:pPr>
             <w:r>
-              <w:t>﻿﻿Developed a scalable event-driven architecture using SQS que</w:t>
-            </w:r>
-            <w:r>
-              <w:t>ue</w:t>
-            </w:r>
-            <w:r>
-              <w:t>s</w:t>
-            </w:r>
-            <w:r>
-              <w:t xml:space="preserve"> on </w:t>
-            </w:r>
+              <w:t>Developed a scalable event-driven architecture using AWS SQS/SNS, consumers, and domain controllers, enhancing the throughput and reliability of loyalty microservices.</w:t>
+            </w:r>
+            <w:r/>
+            <w:r/>
+            <w:r/>
             <w:proofErr w:type="gramStart"/>
-            <w:r>
-              <w:t>AWS(</w:t>
-            </w:r>
+            <w:r/>
             <w:proofErr w:type="gramEnd"/>
-            <w:r>
-              <w:t>SQS, SNS)</w:t>
-            </w:r>
-            <w:r>
-              <w:t>, consumers, and domain controllers, enhancing the throughput and reliability of loyalty microservices.</w:t>
-            </w:r>
+            <w:r/>
+            <w:r/>
           </w:p>
           <w:p>
             <w:pPr>
               <w:pStyle w:val="Positionbullet"/>
             </w:pPr>
             <w:r>
-              <w:t xml:space="preserve">﻿﻿Integrated microservices with core enterprise systems including </w:t>
+              <w:t>Integrated microservices with core enterprise systems including PredictSpring POS, Aptos POS, UA.com, OMS, SFSC, and SFCC.</w:t>
             </w:r>
             <w:proofErr w:type="spellStart"/>
-            <w:r>
-              <w:t>PredictSpring</w:t>
-            </w:r>
+            <w:r/>
             <w:proofErr w:type="spellEnd"/>
-            <w:r>
-              <w:t xml:space="preserve"> POS, Aptos POS, UA.com, OMS, SFSC, and SFCC.</w:t>
+            <w:r/>
+          </w:p>
+          <w:p>
+            <w:pPr>
+              <w:pStyle w:val="Positionbullet"/>
+            </w:pPr>
+            <w:r>
+              <w:t>On a separate commerce team, delivered Share &amp; Transfer Cart end to end across the Next.js/React storefront and GraphQL APIs, including multi-region shared-cart and email flows.</w:t>
+            </w:r>
+          </w:p>
+          <w:p>
+            <w:pPr>
+              <w:pStyle w:val="Positionbullet"/>
+            </w:pPr>
+            <w:r>
+              <w:t>Built and hardened commerce experiences including shoppable social content, checkout, returns, search tracking, and fulfillment notifications with comprehensive automated tests.</w:t>
             </w:r>
           </w:p>
           <w:p>
@@ -1662,6 +1651,8 @@
           <w:p>
             <w:pPr>
               <w:pStyle w:val="ResumePosition"/>
+              <w:keepNext/>
+              <w:pageBreakBefore/>
             </w:pPr>
             <w:r>
               <w:lastRenderedPageBreak/>
@@ -1671,6 +1662,7 @@
           <w:p>
             <w:pPr>
               <w:pStyle w:val="ResumeCompany"/>
+              <w:keepNext/>
               <w:rPr>
                 <w:color w:val="595959"/>
               </w:rPr>

</xml_diff>